<commit_message>
Eisen aan inwinning en aanlevering peilgegeven
</commit_message>
<xml_diff>
--- a/Overige datasets/peilgegevens vaarwegen/Eisen aan inwinning en aanlevering peilgegeven vaarwegen PNH.docx
+++ b/Overige datasets/peilgegevens vaarwegen/Eisen aan inwinning en aanlevering peilgegeven vaarwegen PNH.docx
@@ -14189,6 +14189,50 @@
     <Data/>
     <Filter/>
   </Receiver>
+  <Receiver>
+    <Name>Document ID Generator</Name>
+    <Synchronization>Synchronous</Synchronization>
+    <Type>10001</Type>
+    <SequenceNumber>1000</SequenceNumber>
+    <Url/>
+    <Assembly>Microsoft.Office.DocumentManagement, Version=16.0.0.0, Culture=neutral, PublicKeyToken=71e9bce111e9429c</Assembly>
+    <Class>Microsoft.Office.DocumentManagement.Internal.DocIdHandler</Class>
+    <Data/>
+    <Filter/>
+  </Receiver>
+  <Receiver>
+    <Name>Document ID Generator</Name>
+    <Synchronization>Synchronous</Synchronization>
+    <Type>10002</Type>
+    <SequenceNumber>1001</SequenceNumber>
+    <Url/>
+    <Assembly>Microsoft.Office.DocumentManagement, Version=16.0.0.0, Culture=neutral, PublicKeyToken=71e9bce111e9429c</Assembly>
+    <Class>Microsoft.Office.DocumentManagement.Internal.DocIdHandler</Class>
+    <Data/>
+    <Filter/>
+  </Receiver>
+  <Receiver>
+    <Name>Document ID Generator</Name>
+    <Synchronization>Synchronous</Synchronization>
+    <Type>10004</Type>
+    <SequenceNumber>1002</SequenceNumber>
+    <Url/>
+    <Assembly>Microsoft.Office.DocumentManagement, Version=16.0.0.0, Culture=neutral, PublicKeyToken=71e9bce111e9429c</Assembly>
+    <Class>Microsoft.Office.DocumentManagement.Internal.DocIdHandler</Class>
+    <Data/>
+    <Filter/>
+  </Receiver>
+  <Receiver>
+    <Name>Document ID Generator</Name>
+    <Synchronization>Synchronous</Synchronization>
+    <Type>10006</Type>
+    <SequenceNumber>1003</SequenceNumber>
+    <Url/>
+    <Assembly>Microsoft.Office.DocumentManagement, Version=16.0.0.0, Culture=neutral, PublicKeyToken=71e9bce111e9429c</Assembly>
+    <Class>Microsoft.Office.DocumentManagement.Internal.DocIdHandler</Class>
+    <Data/>
+    <Filter/>
+  </Receiver>
 </spe:Receivers>
 </file>
 
@@ -14269,19 +14313,19 @@
       <Url>https://provincienoordholland.sharepoint.com/teams/id-tba-kw/_layouts/15/DocIdRedir.aspx?ID=RARCYAHXDCWJ-1495696225-8305</Url>
       <Description>RARCYAHXDCWJ-1495696225-8305</Description>
     </_dlc_DocIdUrl>
-    <gewijzigd xmlns="7373ea53-f8b4-48b8-ba68-2e67955cb15a" xsi:nil="true"/>
     <datumtijd xmlns="7373ea53-f8b4-48b8-ba68-2e67955cb15a" xsi:nil="true"/>
+    <contenttype0 xmlns="7373ea53-f8b4-48b8-ba68-2e67955cb15a" xsi:nil="true"/>
   </documentManagement>
 </p:properties>
 </file>
 
 <file path=customXml/item3.xml><?xml version="1.0" encoding="utf-8"?>
-<ct:contentTypeSchema xmlns:ct="http://schemas.microsoft.com/office/2006/metadata/contentType" xmlns:ma="http://schemas.microsoft.com/office/2006/metadata/properties/metaAttributes" ct:_="" ma:_="" ma:contentTypeName="Word bestand" ma:contentTypeID="0x0101006261D5E71047644AB60DEC2636D6DD73007DF9E41C8DAA6B47AB7B487B820AA774" ma:contentTypeVersion="431" ma:contentTypeDescription="" ma:contentTypeScope="" ma:versionID="b54f2e188784a71b8248a7bf2667ca48">
-  <xsd:schema xmlns:xsd="http://www.w3.org/2001/XMLSchema" xmlns:xs="http://www.w3.org/2001/XMLSchema" xmlns:p="http://schemas.microsoft.com/office/2006/metadata/properties" xmlns:ns2="b651a5c8-18d1-4676-949b-b33c2c763b6d" xmlns:ns3="d7a187d9-a854-4467-9103-8adc49ee9a7f" xmlns:ns4="6daa60e2-bd58-4dcb-97ac-d16bd0a0cc7d" xmlns:ns5="7373ea53-f8b4-48b8-ba68-2e67955cb15a" targetNamespace="http://schemas.microsoft.com/office/2006/metadata/properties" ma:root="true" ma:fieldsID="c4f5d61cabfdaaa27eaee06613ce38fb" ns2:_="" ns3:_="" ns4:_="" ns5:_="">
+<ct:contentTypeSchema xmlns:ct="http://schemas.microsoft.com/office/2006/metadata/contentType" xmlns:ma="http://schemas.microsoft.com/office/2006/metadata/properties/metaAttributes" ct:_="" ma:_="" ma:contentTypeName="Word bestand" ma:contentTypeID="0x0101006261D5E71047644AB60DEC2636D6DD73007DF9E41C8DAA6B47AB7B487B820AA774" ma:contentTypeVersion="439" ma:contentTypeDescription="" ma:contentTypeScope="" ma:versionID="6ab1f202b6998e468e16d7a7023beb21">
+  <xsd:schema xmlns:xsd="http://www.w3.org/2001/XMLSchema" xmlns:xs="http://www.w3.org/2001/XMLSchema" xmlns:p="http://schemas.microsoft.com/office/2006/metadata/properties" xmlns:ns2="b651a5c8-18d1-4676-949b-b33c2c763b6d" xmlns:ns3="d7a187d9-a854-4467-9103-8adc49ee9a7f" xmlns:ns4="7373ea53-f8b4-48b8-ba68-2e67955cb15a" xmlns:ns5="6daa60e2-bd58-4dcb-97ac-d16bd0a0cc7d" targetNamespace="http://schemas.microsoft.com/office/2006/metadata/properties" ma:root="true" ma:fieldsID="50a923754357253d39b4c21365d58890" ns2:_="" ns3:_="" ns4:_="" ns5:_="">
     <xsd:import namespace="b651a5c8-18d1-4676-949b-b33c2c763b6d"/>
     <xsd:import namespace="d7a187d9-a854-4467-9103-8adc49ee9a7f"/>
+    <xsd:import namespace="7373ea53-f8b4-48b8-ba68-2e67955cb15a"/>
     <xsd:import namespace="6daa60e2-bd58-4dcb-97ac-d16bd0a0cc7d"/>
-    <xsd:import namespace="7373ea53-f8b4-48b8-ba68-2e67955cb15a"/>
     <xsd:element name="properties">
       <xsd:complexType>
         <xsd:sequence>
@@ -14329,22 +14373,22 @@
                 <xsd:element ref="ns2:cacfb565f8424c199369c1c3170d561c" minOccurs="0"/>
                 <xsd:element ref="ns2:TaxCatchAll" minOccurs="0"/>
                 <xsd:element ref="ns2:TaxCatchAllLabel" minOccurs="0"/>
-                <xsd:element ref="ns4:SharedWithDetails" minOccurs="0"/>
-                <xsd:element ref="ns4:SharedWithUsers" minOccurs="0"/>
-                <xsd:element ref="ns5:lcf76f155ced4ddcb4097134ff3c332f" minOccurs="0"/>
-                <xsd:element ref="ns5:datum" minOccurs="0"/>
-                <xsd:element ref="ns5:MediaServiceOCR" minOccurs="0"/>
-                <xsd:element ref="ns5:MediaServiceGenerationTime" minOccurs="0"/>
-                <xsd:element ref="ns5:MediaServiceDateTaken" minOccurs="0"/>
-                <xsd:element ref="ns5:MediaServiceEventHashCode" minOccurs="0"/>
-                <xsd:element ref="ns5:MediaServiceLocation" minOccurs="0"/>
-                <xsd:element ref="ns5:gewijzigd" minOccurs="0"/>
-                <xsd:element ref="ns5:datumtijd" minOccurs="0"/>
-                <xsd:element ref="ns5:MediaServiceMetadata" minOccurs="0"/>
-                <xsd:element ref="ns5:MediaLengthInSeconds" minOccurs="0"/>
-                <xsd:element ref="ns5:MediaServiceSearchProperties" minOccurs="0"/>
-                <xsd:element ref="ns5:MediaServiceObjectDetectorVersions" minOccurs="0"/>
-                <xsd:element ref="ns5:MediaServiceFastMetadata" minOccurs="0"/>
+                <xsd:element ref="ns4:lcf76f155ced4ddcb4097134ff3c332f" minOccurs="0"/>
+                <xsd:element ref="ns4:datum" minOccurs="0"/>
+                <xsd:element ref="ns4:MediaServiceOCR" minOccurs="0"/>
+                <xsd:element ref="ns4:MediaServiceGenerationTime" minOccurs="0"/>
+                <xsd:element ref="ns4:MediaServiceDateTaken" minOccurs="0"/>
+                <xsd:element ref="ns4:MediaServiceEventHashCode" minOccurs="0"/>
+                <xsd:element ref="ns4:MediaServiceLocation" minOccurs="0"/>
+                <xsd:element ref="ns4:datumtijd" minOccurs="0"/>
+                <xsd:element ref="ns4:MediaServiceMetadata" minOccurs="0"/>
+                <xsd:element ref="ns4:MediaLengthInSeconds" minOccurs="0"/>
+                <xsd:element ref="ns4:MediaServiceSearchProperties" minOccurs="0"/>
+                <xsd:element ref="ns4:MediaServiceObjectDetectorVersions" minOccurs="0"/>
+                <xsd:element ref="ns4:MediaServiceFastMetadata" minOccurs="0"/>
+                <xsd:element ref="ns5:SharedWithUsers" minOccurs="0"/>
+                <xsd:element ref="ns5:SharedWithDetails" minOccurs="0"/>
+                <xsd:element ref="ns4:contenttype0" minOccurs="0"/>
               </xsd:all>
             </xsd:complexType>
           </xsd:element>
@@ -14636,17 +14680,92 @@
       </xsd:simpleType>
     </xsd:element>
   </xsd:schema>
-  <xsd:schema xmlns:xsd="http://www.w3.org/2001/XMLSchema" xmlns:xs="http://www.w3.org/2001/XMLSchema" xmlns:dms="http://schemas.microsoft.com/office/2006/documentManagement/types" xmlns:pc="http://schemas.microsoft.com/office/infopath/2007/PartnerControls" targetNamespace="6daa60e2-bd58-4dcb-97ac-d16bd0a0cc7d" elementFormDefault="qualified">
+  <xsd:schema xmlns:xsd="http://www.w3.org/2001/XMLSchema" xmlns:xs="http://www.w3.org/2001/XMLSchema" xmlns:dms="http://schemas.microsoft.com/office/2006/documentManagement/types" xmlns:pc="http://schemas.microsoft.com/office/infopath/2007/PartnerControls" targetNamespace="7373ea53-f8b4-48b8-ba68-2e67955cb15a" elementFormDefault="qualified">
     <xsd:import namespace="http://schemas.microsoft.com/office/2006/documentManagement/types"/>
     <xsd:import namespace="http://schemas.microsoft.com/office/infopath/2007/PartnerControls"/>
-    <xsd:element name="SharedWithDetails" ma:index="59" nillable="true" ma:displayName="Gedeeld met details" ma:internalName="SharedWithDetails" ma:readOnly="true">
+    <xsd:element name="lcf76f155ced4ddcb4097134ff3c332f" ma:index="59" nillable="true" ma:taxonomy="true" ma:internalName="lcf76f155ced4ddcb4097134ff3c332f" ma:taxonomyFieldName="MediaServiceImageTags" ma:displayName="Afbeeldingtags" ma:readOnly="false" ma:fieldId="{5cf76f15-5ced-4ddc-b409-7134ff3c332f}" ma:taxonomyMulti="true" ma:sspId="2137f917-9df2-4fce-b447-1341bd3a5c8c" ma:termSetId="09814cd3-568e-fe90-9814-8d621ff8fb84" ma:anchorId="fba54fb3-c3e1-fe81-a776-ca4b69148c4d" ma:open="true" ma:isKeyword="false">
+      <xsd:complexType>
+        <xsd:sequence>
+          <xsd:element ref="pc:Terms" minOccurs="0" maxOccurs="1"/>
+        </xsd:sequence>
+      </xsd:complexType>
+    </xsd:element>
+    <xsd:element name="datum" ma:index="60" nillable="true" ma:displayName="datum" ma:format="DateTime" ma:internalName="datum">
+      <xsd:simpleType>
+        <xsd:restriction base="dms:DateTime"/>
+      </xsd:simpleType>
+    </xsd:element>
+    <xsd:element name="MediaServiceOCR" ma:index="61" nillable="true" ma:displayName="Extracted Text" ma:internalName="MediaServiceOCR" ma:readOnly="true">
       <xsd:simpleType>
         <xsd:restriction base="dms:Note">
           <xsd:maxLength value="255"/>
         </xsd:restriction>
       </xsd:simpleType>
     </xsd:element>
-    <xsd:element name="SharedWithUsers" ma:index="60" nillable="true" ma:displayName="Gedeeld met" ma:internalName="SharedWithUsers" ma:readOnly="true">
+    <xsd:element name="MediaServiceGenerationTime" ma:index="62" nillable="true" ma:displayName="MediaServiceGenerationTime" ma:hidden="true" ma:internalName="MediaServiceGenerationTime" ma:readOnly="true">
+      <xsd:simpleType>
+        <xsd:restriction base="dms:Text"/>
+      </xsd:simpleType>
+    </xsd:element>
+    <xsd:element name="MediaServiceDateTaken" ma:index="63" nillable="true" ma:displayName="MediaServiceDateTaken" ma:hidden="true" ma:indexed="true" ma:internalName="MediaServiceDateTaken" ma:readOnly="true">
+      <xsd:simpleType>
+        <xsd:restriction base="dms:Text"/>
+      </xsd:simpleType>
+    </xsd:element>
+    <xsd:element name="MediaServiceEventHashCode" ma:index="64" nillable="true" ma:displayName="MediaServiceEventHashCode" ma:hidden="true" ma:internalName="MediaServiceEventHashCode" ma:readOnly="true">
+      <xsd:simpleType>
+        <xsd:restriction base="dms:Text"/>
+      </xsd:simpleType>
+    </xsd:element>
+    <xsd:element name="MediaServiceLocation" ma:index="65" nillable="true" ma:displayName="Location" ma:indexed="true" ma:internalName="MediaServiceLocation" ma:readOnly="true">
+      <xsd:simpleType>
+        <xsd:restriction base="dms:Text"/>
+      </xsd:simpleType>
+    </xsd:element>
+    <xsd:element name="datumtijd" ma:index="66" nillable="true" ma:displayName="datum tijd" ma:format="DateOnly" ma:internalName="datumtijd">
+      <xsd:simpleType>
+        <xsd:restriction base="dms:DateTime"/>
+      </xsd:simpleType>
+    </xsd:element>
+    <xsd:element name="MediaServiceMetadata" ma:index="67" nillable="true" ma:displayName="MediaServiceMetadata" ma:hidden="true" ma:internalName="MediaServiceMetadata" ma:readOnly="true">
+      <xsd:simpleType>
+        <xsd:restriction base="dms:Note"/>
+      </xsd:simpleType>
+    </xsd:element>
+    <xsd:element name="MediaLengthInSeconds" ma:index="68" nillable="true" ma:displayName="MediaLengthInSeconds" ma:hidden="true" ma:internalName="MediaLengthInSeconds" ma:readOnly="true">
+      <xsd:simpleType>
+        <xsd:restriction base="dms:Unknown"/>
+      </xsd:simpleType>
+    </xsd:element>
+    <xsd:element name="MediaServiceSearchProperties" ma:index="69" nillable="true" ma:displayName="MediaServiceSearchProperties" ma:hidden="true" ma:internalName="MediaServiceSearchProperties" ma:readOnly="true">
+      <xsd:simpleType>
+        <xsd:restriction base="dms:Note"/>
+      </xsd:simpleType>
+    </xsd:element>
+    <xsd:element name="MediaServiceObjectDetectorVersions" ma:index="70" nillable="true" ma:displayName="MediaServiceObjectDetectorVersions" ma:hidden="true" ma:indexed="true" ma:internalName="MediaServiceObjectDetectorVersions" ma:readOnly="true">
+      <xsd:simpleType>
+        <xsd:restriction base="dms:Text"/>
+      </xsd:simpleType>
+    </xsd:element>
+    <xsd:element name="MediaServiceFastMetadata" ma:index="71" nillable="true" ma:displayName="MediaServiceFastMetadata" ma:hidden="true" ma:internalName="MediaServiceFastMetadata" ma:readOnly="true">
+      <xsd:simpleType>
+        <xsd:restriction base="dms:Note"/>
+      </xsd:simpleType>
+    </xsd:element>
+    <xsd:element name="contenttype0" ma:index="75" nillable="true" ma:displayName="ContentType" ma:description="DocumentenSet" ma:format="Dropdown" ma:internalName="contenttype0">
+      <xsd:simpleType>
+        <xsd:restriction base="dms:Choice">
+          <xsd:enumeration value="Keuze 1"/>
+          <xsd:enumeration value="Keuze 2"/>
+          <xsd:enumeration value="Keuze 3"/>
+        </xsd:restriction>
+      </xsd:simpleType>
+    </xsd:element>
+  </xsd:schema>
+  <xsd:schema xmlns:xsd="http://www.w3.org/2001/XMLSchema" xmlns:xs="http://www.w3.org/2001/XMLSchema" xmlns:dms="http://schemas.microsoft.com/office/2006/documentManagement/types" xmlns:pc="http://schemas.microsoft.com/office/infopath/2007/PartnerControls" targetNamespace="6daa60e2-bd58-4dcb-97ac-d16bd0a0cc7d" elementFormDefault="qualified">
+    <xsd:import namespace="http://schemas.microsoft.com/office/2006/documentManagement/types"/>
+    <xsd:import namespace="http://schemas.microsoft.com/office/infopath/2007/PartnerControls"/>
+    <xsd:element name="SharedWithUsers" ma:index="72" nillable="true" ma:displayName="Gedeeld met" ma:internalName="SharedWithUsers" ma:readOnly="true">
       <xsd:complexType>
         <xsd:complexContent>
           <xsd:extension base="dms:UserMulti">
@@ -14665,84 +14784,11 @@
         </xsd:complexContent>
       </xsd:complexType>
     </xsd:element>
-  </xsd:schema>
-  <xsd:schema xmlns:xsd="http://www.w3.org/2001/XMLSchema" xmlns:xs="http://www.w3.org/2001/XMLSchema" xmlns:dms="http://schemas.microsoft.com/office/2006/documentManagement/types" xmlns:pc="http://schemas.microsoft.com/office/infopath/2007/PartnerControls" targetNamespace="7373ea53-f8b4-48b8-ba68-2e67955cb15a" elementFormDefault="qualified">
-    <xsd:import namespace="http://schemas.microsoft.com/office/2006/documentManagement/types"/>
-    <xsd:import namespace="http://schemas.microsoft.com/office/infopath/2007/PartnerControls"/>
-    <xsd:element name="lcf76f155ced4ddcb4097134ff3c332f" ma:index="62" nillable="true" ma:taxonomy="true" ma:internalName="lcf76f155ced4ddcb4097134ff3c332f" ma:taxonomyFieldName="MediaServiceImageTags" ma:displayName="Afbeeldingtags" ma:readOnly="false" ma:fieldId="{5cf76f15-5ced-4ddc-b409-7134ff3c332f}" ma:taxonomyMulti="true" ma:sspId="2137f917-9df2-4fce-b447-1341bd3a5c8c" ma:termSetId="09814cd3-568e-fe90-9814-8d621ff8fb84" ma:anchorId="fba54fb3-c3e1-fe81-a776-ca4b69148c4d" ma:open="true" ma:isKeyword="false">
-      <xsd:complexType>
-        <xsd:sequence>
-          <xsd:element ref="pc:Terms" minOccurs="0" maxOccurs="1"/>
-        </xsd:sequence>
-      </xsd:complexType>
-    </xsd:element>
-    <xsd:element name="datum" ma:index="63" nillable="true" ma:displayName="datum" ma:format="DateTime" ma:internalName="datum">
-      <xsd:simpleType>
-        <xsd:restriction base="dms:DateTime"/>
-      </xsd:simpleType>
-    </xsd:element>
-    <xsd:element name="MediaServiceOCR" ma:index="64" nillable="true" ma:displayName="Extracted Text" ma:internalName="MediaServiceOCR" ma:readOnly="true">
+    <xsd:element name="SharedWithDetails" ma:index="74" nillable="true" ma:displayName="Gedeeld met details" ma:internalName="SharedWithDetails" ma:readOnly="true">
       <xsd:simpleType>
         <xsd:restriction base="dms:Note">
           <xsd:maxLength value="255"/>
         </xsd:restriction>
-      </xsd:simpleType>
-    </xsd:element>
-    <xsd:element name="MediaServiceGenerationTime" ma:index="65" nillable="true" ma:displayName="MediaServiceGenerationTime" ma:hidden="true" ma:internalName="MediaServiceGenerationTime" ma:readOnly="true">
-      <xsd:simpleType>
-        <xsd:restriction base="dms:Text"/>
-      </xsd:simpleType>
-    </xsd:element>
-    <xsd:element name="MediaServiceDateTaken" ma:index="66" nillable="true" ma:displayName="MediaServiceDateTaken" ma:hidden="true" ma:indexed="true" ma:internalName="MediaServiceDateTaken" ma:readOnly="true">
-      <xsd:simpleType>
-        <xsd:restriction base="dms:Text"/>
-      </xsd:simpleType>
-    </xsd:element>
-    <xsd:element name="MediaServiceEventHashCode" ma:index="67" nillable="true" ma:displayName="MediaServiceEventHashCode" ma:hidden="true" ma:internalName="MediaServiceEventHashCode" ma:readOnly="true">
-      <xsd:simpleType>
-        <xsd:restriction base="dms:Text"/>
-      </xsd:simpleType>
-    </xsd:element>
-    <xsd:element name="MediaServiceLocation" ma:index="68" nillable="true" ma:displayName="Location" ma:indexed="true" ma:internalName="MediaServiceLocation" ma:readOnly="true">
-      <xsd:simpleType>
-        <xsd:restriction base="dms:Text"/>
-      </xsd:simpleType>
-    </xsd:element>
-    <xsd:element name="gewijzigd" ma:index="69" nillable="true" ma:displayName="gewijzigd" ma:format="Dropdown" ma:internalName="gewijzigd">
-      <xsd:simpleType>
-        <xsd:restriction base="dms:Text">
-          <xsd:maxLength value="255"/>
-        </xsd:restriction>
-      </xsd:simpleType>
-    </xsd:element>
-    <xsd:element name="datumtijd" ma:index="70" nillable="true" ma:displayName="datum tijd" ma:format="DateOnly" ma:internalName="datumtijd">
-      <xsd:simpleType>
-        <xsd:restriction base="dms:DateTime"/>
-      </xsd:simpleType>
-    </xsd:element>
-    <xsd:element name="MediaServiceMetadata" ma:index="71" nillable="true" ma:displayName="MediaServiceMetadata" ma:hidden="true" ma:internalName="MediaServiceMetadata" ma:readOnly="true">
-      <xsd:simpleType>
-        <xsd:restriction base="dms:Note"/>
-      </xsd:simpleType>
-    </xsd:element>
-    <xsd:element name="MediaLengthInSeconds" ma:index="72" nillable="true" ma:displayName="MediaLengthInSeconds" ma:hidden="true" ma:internalName="MediaLengthInSeconds" ma:readOnly="true">
-      <xsd:simpleType>
-        <xsd:restriction base="dms:Unknown"/>
-      </xsd:simpleType>
-    </xsd:element>
-    <xsd:element name="MediaServiceSearchProperties" ma:index="73" nillable="true" ma:displayName="MediaServiceSearchProperties" ma:hidden="true" ma:internalName="MediaServiceSearchProperties" ma:readOnly="true">
-      <xsd:simpleType>
-        <xsd:restriction base="dms:Note"/>
-      </xsd:simpleType>
-    </xsd:element>
-    <xsd:element name="MediaServiceObjectDetectorVersions" ma:index="74" nillable="true" ma:displayName="MediaServiceObjectDetectorVersions" ma:hidden="true" ma:indexed="true" ma:internalName="MediaServiceObjectDetectorVersions" ma:readOnly="true">
-      <xsd:simpleType>
-        <xsd:restriction base="dms:Text"/>
-      </xsd:simpleType>
-    </xsd:element>
-    <xsd:element name="MediaServiceFastMetadata" ma:index="75" nillable="true" ma:displayName="MediaServiceFastMetadata" ma:hidden="true" ma:internalName="MediaServiceFastMetadata" ma:readOnly="true">
-      <xsd:simpleType>
-        <xsd:restriction base="dms:Note"/>
       </xsd:simpleType>
     </xsd:element>
   </xsd:schema>
@@ -14864,11 +14910,7 @@
 </file>
 
 <file path=customXml/itemProps1.xml><?xml version="1.0" encoding="utf-8"?>
-<ds:datastoreItem xmlns:ds="http://schemas.openxmlformats.org/officeDocument/2006/customXml" ds:itemID="{D8216A76-8F41-486C-93FD-40785BBBC29A}">
-  <ds:schemaRefs>
-    <ds:schemaRef ds:uri="http://schemas.microsoft.com/sharepoint/events"/>
-  </ds:schemaRefs>
-</ds:datastoreItem>
+<ds:datastoreItem xmlns:ds="http://schemas.openxmlformats.org/officeDocument/2006/customXml" ds:itemID="{1B126F1C-4792-4FE0-8988-CD7B20E0D303}"/>
 </file>
 
 <file path=customXml/itemProps2.xml><?xml version="1.0" encoding="utf-8"?>
@@ -14884,7 +14926,7 @@
 </file>
 
 <file path=customXml/itemProps3.xml><?xml version="1.0" encoding="utf-8"?>
-<ds:datastoreItem xmlns:ds="http://schemas.openxmlformats.org/officeDocument/2006/customXml" ds:itemID="{452B79D1-384A-412C-8C3B-52004A57D516}"/>
+<ds:datastoreItem xmlns:ds="http://schemas.openxmlformats.org/officeDocument/2006/customXml" ds:itemID="{D698E26B-E468-443D-B875-1D72E0CC08B8}"/>
 </file>
 
 <file path=customXml/itemProps4.xml><?xml version="1.0" encoding="utf-8"?>

</xml_diff>